<commit_message>
Limpieza de archivos Claude Code y actualización de estructura de conciliaciones
</commit_message>
<xml_diff>
--- a/JAGI_Contabilidad/Reglas para Conciliacion_Datafanos.docx
+++ b/JAGI_Contabilidad/Reglas para Conciliacion_Datafanos.docx
@@ -53,8 +53,6 @@
         </w:rPr>
         <w:t>Conciliación Datafono vs Auxiliar</w:t>
       </w:r>
-      <w:bookmarkStart w:id="0" w:name="_GoBack"/>
-      <w:bookmarkEnd w:id="0"/>
     </w:p>
     <w:p>
       <w:pPr>
@@ -82,6 +80,8 @@
         <w:spacing w:before="100" w:beforeAutospacing="1" w:after="100" w:afterAutospacing="1" w:line="240" w:lineRule="auto"/>
         <w:rPr>
           <w:rFonts w:ascii="Times New Roman" w:eastAsia="Times New Roman" w:hAnsi="Times New Roman" w:cs="Times New Roman"/>
+          <w:b/>
+          <w:bCs/>
           <w:sz w:val="24"/>
           <w:szCs w:val="24"/>
           <w:lang w:val="es-CO"/>
@@ -99,13 +99,22 @@
       <w:r>
         <w:rPr>
           <w:rFonts w:ascii="Times New Roman" w:eastAsia="Times New Roman" w:hAnsi="Times New Roman" w:cs="Times New Roman"/>
-          <w:b/>
-          <w:bCs/>
-          <w:sz w:val="24"/>
-          <w:szCs w:val="24"/>
-          <w:lang w:val="es-CO"/>
-        </w:rPr>
-        <w:t>auxiliar contable</w:t>
+          <w:sz w:val="24"/>
+          <w:szCs w:val="24"/>
+          <w:lang w:val="es-CO"/>
+        </w:rPr>
+        <w:t xml:space="preserve">archivo </w:t>
+      </w:r>
+      <w:r>
+        <w:rPr>
+          <w:rFonts w:ascii="Times New Roman" w:eastAsia="Times New Roman" w:hAnsi="Times New Roman" w:cs="Times New Roman"/>
+          <w:b/>
+          <w:bCs/>
+          <w:sz w:val="24"/>
+          <w:szCs w:val="24"/>
+          <w:lang w:val="es-CO"/>
+        </w:rPr>
+        <w:t>auxiliar</w:t>
       </w:r>
       <w:r>
         <w:rPr>
@@ -294,7 +303,7 @@
           <w:szCs w:val="27"/>
           <w:lang w:val="es-CO"/>
         </w:rPr>
-        <w:t>1. Auxiliar contable</w:t>
+        <w:t>1. Auxiliar</w:t>
       </w:r>
     </w:p>
     <w:p>
@@ -349,7 +358,7 @@
           <w:szCs w:val="24"/>
           <w:lang w:val="es-CO"/>
         </w:rPr>
-        <w:t>CONCEPTO</w:t>
+        <w:t>NOTA</w:t>
       </w:r>
       <w:r>
         <w:rPr>
@@ -378,8 +387,10 @@
       <w:r>
         <w:rPr>
           <w:rFonts w:ascii="Times New Roman" w:eastAsia="Times New Roman" w:hAnsi="Times New Roman" w:cs="Times New Roman"/>
-          <w:sz w:val="24"/>
-          <w:szCs w:val="24"/>
+          <w:b/>
+          <w:sz w:val="24"/>
+          <w:szCs w:val="24"/>
+          <w:highlight w:val="yellow"/>
           <w:lang w:val="es-CO"/>
         </w:rPr>
         <w:t xml:space="preserve">Campo </w:t>
@@ -391,6 +402,7 @@
           <w:bCs/>
           <w:sz w:val="24"/>
           <w:szCs w:val="24"/>
+          <w:highlight w:val="yellow"/>
           <w:lang w:val="es-CO"/>
         </w:rPr>
         <w:t>valor</w:t>
@@ -398,11 +410,22 @@
       <w:r>
         <w:rPr>
           <w:rFonts w:ascii="Times New Roman" w:eastAsia="Times New Roman" w:hAnsi="Times New Roman" w:cs="Times New Roman"/>
-          <w:sz w:val="24"/>
-          <w:szCs w:val="24"/>
-          <w:lang w:val="es-CO"/>
-        </w:rPr>
-        <w:t xml:space="preserve"> → valor total contabilizado (agrupado) </w:t>
+          <w:b/>
+          <w:sz w:val="24"/>
+          <w:szCs w:val="24"/>
+          <w:highlight w:val="yellow"/>
+          <w:lang w:val="es-CO"/>
+        </w:rPr>
+        <w:t xml:space="preserve"> → valor total contabilizado (agrupado</w:t>
+      </w:r>
+      <w:r>
+        <w:rPr>
+          <w:rFonts w:ascii="Times New Roman" w:eastAsia="Times New Roman" w:hAnsi="Times New Roman" w:cs="Times New Roman"/>
+          <w:sz w:val="24"/>
+          <w:szCs w:val="24"/>
+          <w:lang w:val="es-CO"/>
+        </w:rPr>
+        <w:t xml:space="preserve">) </w:t>
       </w:r>
     </w:p>
     <w:p>
@@ -627,7 +650,11 @@
           <w:lang w:val="es-CO"/>
         </w:rPr>
       </w:pPr>
-      <w:r>
+    </w:p>
+    <w:p>
+      <w:pPr>
+        <w:spacing w:before="100" w:beforeAutospacing="1" w:after="100" w:afterAutospacing="1" w:line="240" w:lineRule="auto"/>
+        <w:outlineLvl w:val="1"/>
         <w:rPr>
           <w:rFonts w:ascii="Times New Roman" w:eastAsia="Times New Roman" w:hAnsi="Times New Roman" w:cs="Times New Roman"/>
           <w:b/>
@@ -636,6 +663,73 @@
           <w:szCs w:val="36"/>
           <w:lang w:val="es-CO"/>
         </w:rPr>
+      </w:pPr>
+    </w:p>
+    <w:p>
+      <w:pPr>
+        <w:spacing w:before="100" w:beforeAutospacing="1" w:after="100" w:afterAutospacing="1" w:line="240" w:lineRule="auto"/>
+        <w:outlineLvl w:val="1"/>
+        <w:rPr>
+          <w:rFonts w:ascii="Times New Roman" w:eastAsia="Times New Roman" w:hAnsi="Times New Roman" w:cs="Times New Roman"/>
+          <w:b/>
+          <w:bCs/>
+          <w:sz w:val="36"/>
+          <w:szCs w:val="36"/>
+          <w:lang w:val="es-CO"/>
+        </w:rPr>
+      </w:pPr>
+    </w:p>
+    <w:p>
+      <w:pPr>
+        <w:spacing w:before="100" w:beforeAutospacing="1" w:after="100" w:afterAutospacing="1" w:line="240" w:lineRule="auto"/>
+        <w:outlineLvl w:val="1"/>
+        <w:rPr>
+          <w:rFonts w:ascii="Times New Roman" w:eastAsia="Times New Roman" w:hAnsi="Times New Roman" w:cs="Times New Roman"/>
+          <w:b/>
+          <w:bCs/>
+          <w:sz w:val="36"/>
+          <w:szCs w:val="36"/>
+          <w:lang w:val="es-CO"/>
+        </w:rPr>
+      </w:pPr>
+    </w:p>
+    <w:p>
+      <w:pPr>
+        <w:spacing w:before="100" w:beforeAutospacing="1" w:after="100" w:afterAutospacing="1" w:line="240" w:lineRule="auto"/>
+        <w:outlineLvl w:val="1"/>
+        <w:rPr>
+          <w:rFonts w:ascii="Times New Roman" w:eastAsia="Times New Roman" w:hAnsi="Times New Roman" w:cs="Times New Roman"/>
+          <w:b/>
+          <w:bCs/>
+          <w:sz w:val="36"/>
+          <w:szCs w:val="36"/>
+          <w:lang w:val="es-CO"/>
+        </w:rPr>
+      </w:pPr>
+    </w:p>
+    <w:p>
+      <w:pPr>
+        <w:spacing w:before="100" w:beforeAutospacing="1" w:after="100" w:afterAutospacing="1" w:line="240" w:lineRule="auto"/>
+        <w:outlineLvl w:val="1"/>
+        <w:rPr>
+          <w:rFonts w:ascii="Times New Roman" w:eastAsia="Times New Roman" w:hAnsi="Times New Roman" w:cs="Times New Roman"/>
+          <w:b/>
+          <w:bCs/>
+          <w:sz w:val="36"/>
+          <w:szCs w:val="36"/>
+          <w:lang w:val="es-CO"/>
+        </w:rPr>
+      </w:pPr>
+      <w:r>
+        <w:rPr>
+          <w:rFonts w:ascii="Times New Roman" w:eastAsia="Times New Roman" w:hAnsi="Times New Roman" w:cs="Times New Roman"/>
+          <w:b/>
+          <w:bCs/>
+          <w:sz w:val="36"/>
+          <w:szCs w:val="36"/>
+          <w:lang w:val="es-CO"/>
+        </w:rPr>
+        <w:lastRenderedPageBreak/>
         <w:t>LÓGICA DEL PROCESO</w:t>
       </w:r>
     </w:p>
@@ -694,6 +788,7 @@
           <w:bCs/>
           <w:sz w:val="24"/>
           <w:szCs w:val="24"/>
+          <w:highlight w:val="yellow"/>
           <w:lang w:val="es-CO"/>
         </w:rPr>
         <w:t>CONCEPTO</w:t>
@@ -706,6 +801,15 @@
           <w:lang w:val="es-CO"/>
         </w:rPr>
         <w:t xml:space="preserve"> </w:t>
+      </w:r>
+      <w:r>
+        <w:rPr>
+          <w:rFonts w:ascii="Times New Roman" w:eastAsia="Times New Roman" w:hAnsi="Times New Roman" w:cs="Times New Roman"/>
+          <w:sz w:val="24"/>
+          <w:szCs w:val="24"/>
+          <w:lang w:val="es-CO"/>
+        </w:rPr>
+        <w:t>NOTA</w:t>
       </w:r>
     </w:p>
     <w:p>
@@ -889,7 +993,6 @@
           <w:szCs w:val="24"/>
           <w:lang w:val="es-CO"/>
         </w:rPr>
-        <w:lastRenderedPageBreak/>
         <w:t>Esta fecha debe coincidir con:</w:t>
       </w:r>
     </w:p>
@@ -985,6 +1088,7 @@
           <w:bCs/>
           <w:sz w:val="27"/>
           <w:szCs w:val="27"/>
+          <w:highlight w:val="green"/>
           <w:lang w:val="es-CO"/>
         </w:rPr>
       </w:pPr>
@@ -995,6 +1099,7 @@
           <w:bCs/>
           <w:sz w:val="27"/>
           <w:szCs w:val="27"/>
+          <w:highlight w:val="green"/>
           <w:lang w:val="es-CO"/>
         </w:rPr>
         <w:t>PASO 2 — Preparar datafono</w:t>
@@ -1007,14 +1112,16 @@
           <w:rFonts w:ascii="Times New Roman" w:eastAsia="Times New Roman" w:hAnsi="Times New Roman" w:cs="Times New Roman"/>
           <w:sz w:val="24"/>
           <w:szCs w:val="24"/>
-          <w:lang w:val="es-CO"/>
-        </w:rPr>
-      </w:pPr>
-      <w:r>
-        <w:rPr>
-          <w:rFonts w:ascii="Times New Roman" w:eastAsia="Times New Roman" w:hAnsi="Times New Roman" w:cs="Times New Roman"/>
-          <w:sz w:val="24"/>
-          <w:szCs w:val="24"/>
+          <w:highlight w:val="green"/>
+          <w:lang w:val="es-CO"/>
+        </w:rPr>
+      </w:pPr>
+      <w:r>
+        <w:rPr>
+          <w:rFonts w:ascii="Times New Roman" w:eastAsia="Times New Roman" w:hAnsi="Times New Roman" w:cs="Times New Roman"/>
+          <w:sz w:val="24"/>
+          <w:szCs w:val="24"/>
+          <w:highlight w:val="green"/>
           <w:lang w:val="es-CO"/>
         </w:rPr>
         <w:t>Agrupar el archivo de datafono así:</w:t>
@@ -1045,6 +1152,7 @@
           <w:rFonts w:ascii="Courier New" w:eastAsia="Times New Roman" w:hAnsi="Courier New" w:cs="Courier New"/>
           <w:sz w:val="20"/>
           <w:szCs w:val="20"/>
+          <w:highlight w:val="green"/>
           <w:lang w:val="es-CO"/>
         </w:rPr>
       </w:pPr>
@@ -1053,6 +1161,7 @@
           <w:rFonts w:ascii="Courier New" w:eastAsia="Times New Roman" w:hAnsi="Courier New" w:cs="Courier New"/>
           <w:sz w:val="20"/>
           <w:szCs w:val="20"/>
+          <w:highlight w:val="green"/>
           <w:lang w:val="es-CO"/>
         </w:rPr>
         <w:t xml:space="preserve">Fecha de Abono + </w:t>
@@ -1063,6 +1172,7 @@
           <w:rFonts w:ascii="Courier New" w:eastAsia="Times New Roman" w:hAnsi="Courier New" w:cs="Courier New"/>
           <w:sz w:val="20"/>
           <w:szCs w:val="20"/>
+          <w:highlight w:val="green"/>
           <w:lang w:val="es-CO"/>
         </w:rPr>
         <w:t>Bol_Ruta</w:t>
@@ -1073,6 +1183,7 @@
           <w:rFonts w:ascii="Courier New" w:eastAsia="Times New Roman" w:hAnsi="Courier New" w:cs="Courier New"/>
           <w:sz w:val="20"/>
           <w:szCs w:val="20"/>
+          <w:highlight w:val="green"/>
           <w:lang w:val="es-CO"/>
         </w:rPr>
         <w:t xml:space="preserve"> → SUM(Valor Neto)</w:t>
@@ -1090,26 +1201,20 @@
       </w:pPr>
       <w:r>
         <w:rPr>
-          <w:rFonts w:ascii="Segoe UI Emoji" w:eastAsia="Times New Roman" w:hAnsi="Segoe UI Emoji" w:cs="Segoe UI Emoji"/>
-          <w:sz w:val="24"/>
-          <w:szCs w:val="24"/>
-        </w:rPr>
-        <w:t>👉</w:t>
-      </w:r>
-      <w:r>
-        <w:rPr>
-          <w:rFonts w:ascii="Times New Roman" w:eastAsia="Times New Roman" w:hAnsi="Times New Roman" w:cs="Times New Roman"/>
-          <w:sz w:val="24"/>
-          <w:szCs w:val="24"/>
-          <w:lang w:val="es-CO"/>
-        </w:rPr>
-        <w:t xml:space="preserve"> Resultado:</w:t>
-      </w:r>
-      <w:r>
-        <w:rPr>
-          <w:rFonts w:ascii="Times New Roman" w:eastAsia="Times New Roman" w:hAnsi="Times New Roman" w:cs="Times New Roman"/>
-          <w:sz w:val="24"/>
-          <w:szCs w:val="24"/>
+          <w:rFonts w:ascii="Times New Roman" w:eastAsia="Times New Roman" w:hAnsi="Times New Roman" w:cs="Times New Roman"/>
+          <w:sz w:val="24"/>
+          <w:szCs w:val="24"/>
+          <w:highlight w:val="green"/>
+          <w:lang w:val="es-CO"/>
+        </w:rPr>
+        <w:t>Resultado:</w:t>
+      </w:r>
+      <w:r>
+        <w:rPr>
+          <w:rFonts w:ascii="Times New Roman" w:eastAsia="Times New Roman" w:hAnsi="Times New Roman" w:cs="Times New Roman"/>
+          <w:sz w:val="24"/>
+          <w:szCs w:val="24"/>
+          <w:highlight w:val="green"/>
           <w:lang w:val="es-CO"/>
         </w:rPr>
         <w:br/>
@@ -1125,16 +1230,6 @@
           <w:szCs w:val="24"/>
         </w:rPr>
       </w:pPr>
-      <w:r>
-        <w:rPr>
-          <w:rFonts w:ascii="Times New Roman" w:eastAsia="Times New Roman" w:hAnsi="Times New Roman" w:cs="Times New Roman"/>
-          <w:sz w:val="24"/>
-          <w:szCs w:val="24"/>
-        </w:rPr>
-        <w:pict w14:anchorId="217A4322">
-          <v:rect id="_x0000_i1030" style="width:0;height:1.5pt" o:hralign="center" o:hrstd="t" o:hr="t" fillcolor="#a0a0a0" stroked="f"/>
-        </w:pict>
-      </w:r>
     </w:p>
     <w:p>
       <w:pPr>
@@ -1146,6 +1241,7 @@
           <w:bCs/>
           <w:sz w:val="27"/>
           <w:szCs w:val="27"/>
+          <w:highlight w:val="yellow"/>
           <w:lang w:val="es-CO"/>
         </w:rPr>
       </w:pPr>
@@ -1156,6 +1252,7 @@
           <w:bCs/>
           <w:sz w:val="27"/>
           <w:szCs w:val="27"/>
+          <w:highlight w:val="yellow"/>
           <w:lang w:val="es-CO"/>
         </w:rPr>
         <w:t>PASO 3 — Cruce de información</w:t>
@@ -1168,14 +1265,16 @@
           <w:rFonts w:ascii="Times New Roman" w:eastAsia="Times New Roman" w:hAnsi="Times New Roman" w:cs="Times New Roman"/>
           <w:sz w:val="24"/>
           <w:szCs w:val="24"/>
-          <w:lang w:val="es-CO"/>
-        </w:rPr>
-      </w:pPr>
-      <w:r>
-        <w:rPr>
-          <w:rFonts w:ascii="Times New Roman" w:eastAsia="Times New Roman" w:hAnsi="Times New Roman" w:cs="Times New Roman"/>
-          <w:sz w:val="24"/>
-          <w:szCs w:val="24"/>
+          <w:highlight w:val="yellow"/>
+          <w:lang w:val="es-CO"/>
+        </w:rPr>
+      </w:pPr>
+      <w:r>
+        <w:rPr>
+          <w:rFonts w:ascii="Times New Roman" w:eastAsia="Times New Roman" w:hAnsi="Times New Roman" w:cs="Times New Roman"/>
+          <w:sz w:val="24"/>
+          <w:szCs w:val="24"/>
+          <w:highlight w:val="yellow"/>
           <w:lang w:val="es-CO"/>
         </w:rPr>
         <w:t>Cruzar:</w:t>
@@ -1215,6 +1314,7 @@
           <w:rFonts w:ascii="Courier New" w:eastAsia="Times New Roman" w:hAnsi="Courier New" w:cs="Courier New"/>
           <w:sz w:val="20"/>
           <w:szCs w:val="20"/>
+          <w:highlight w:val="yellow"/>
           <w:lang w:val="es-CO"/>
         </w:rPr>
         <w:t>Auxiliar.Fecha_Operacion_Extraida</w:t>
@@ -1225,6 +1325,7 @@
           <w:rFonts w:ascii="Courier New" w:eastAsia="Times New Roman" w:hAnsi="Courier New" w:cs="Courier New"/>
           <w:sz w:val="20"/>
           <w:szCs w:val="20"/>
+          <w:highlight w:val="yellow"/>
           <w:lang w:val="es-CO"/>
         </w:rPr>
         <w:br/>
@@ -1235,6 +1336,7 @@
           <w:rFonts w:ascii="Courier New" w:eastAsia="Times New Roman" w:hAnsi="Courier New" w:cs="Courier New"/>
           <w:sz w:val="20"/>
           <w:szCs w:val="20"/>
+          <w:highlight w:val="yellow"/>
           <w:lang w:val="es-CO"/>
         </w:rPr>
         <w:br/>
@@ -1245,6 +1347,7 @@
           <w:rFonts w:ascii="Courier New" w:eastAsia="Times New Roman" w:hAnsi="Courier New" w:cs="Courier New"/>
           <w:sz w:val="20"/>
           <w:szCs w:val="20"/>
+          <w:highlight w:val="yellow"/>
           <w:lang w:val="es-CO"/>
         </w:rPr>
         <w:t>Datafono.Fecha</w:t>
@@ -1255,6 +1358,7 @@
           <w:rFonts w:ascii="Courier New" w:eastAsia="Times New Roman" w:hAnsi="Courier New" w:cs="Courier New"/>
           <w:sz w:val="20"/>
           <w:szCs w:val="20"/>
+          <w:highlight w:val="yellow"/>
           <w:lang w:val="es-CO"/>
         </w:rPr>
         <w:t xml:space="preserve"> de Abono</w:t>
@@ -1269,16 +1373,6 @@
           <w:szCs w:val="24"/>
         </w:rPr>
       </w:pPr>
-      <w:r>
-        <w:rPr>
-          <w:rFonts w:ascii="Times New Roman" w:eastAsia="Times New Roman" w:hAnsi="Times New Roman" w:cs="Times New Roman"/>
-          <w:sz w:val="24"/>
-          <w:szCs w:val="24"/>
-        </w:rPr>
-        <w:pict w14:anchorId="6A6E3F99">
-          <v:rect id="_x0000_i1031" style="width:0;height:1.5pt" o:hralign="center" o:hrstd="t" o:hr="t" fillcolor="#a0a0a0" stroked="f"/>
-        </w:pict>
-      </w:r>
     </w:p>
     <w:p>
       <w:pPr>
@@ -1290,6 +1384,7 @@
           <w:bCs/>
           <w:sz w:val="27"/>
           <w:szCs w:val="27"/>
+          <w:highlight w:val="green"/>
           <w:lang w:val="es-CO"/>
         </w:rPr>
       </w:pPr>
@@ -1300,6 +1395,7 @@
           <w:bCs/>
           <w:sz w:val="27"/>
           <w:szCs w:val="27"/>
+          <w:highlight w:val="green"/>
           <w:lang w:val="es-CO"/>
         </w:rPr>
         <w:t>PASO 4 — Construcción del archivo final</w:t>
@@ -1312,14 +1408,16 @@
           <w:rFonts w:ascii="Times New Roman" w:eastAsia="Times New Roman" w:hAnsi="Times New Roman" w:cs="Times New Roman"/>
           <w:sz w:val="24"/>
           <w:szCs w:val="24"/>
-          <w:lang w:val="es-CO"/>
-        </w:rPr>
-      </w:pPr>
-      <w:r>
-        <w:rPr>
-          <w:rFonts w:ascii="Times New Roman" w:eastAsia="Times New Roman" w:hAnsi="Times New Roman" w:cs="Times New Roman"/>
-          <w:sz w:val="24"/>
-          <w:szCs w:val="24"/>
+          <w:highlight w:val="green"/>
+          <w:lang w:val="es-CO"/>
+        </w:rPr>
+      </w:pPr>
+      <w:r>
+        <w:rPr>
+          <w:rFonts w:ascii="Times New Roman" w:eastAsia="Times New Roman" w:hAnsi="Times New Roman" w:cs="Times New Roman"/>
+          <w:sz w:val="24"/>
+          <w:szCs w:val="24"/>
+          <w:highlight w:val="green"/>
           <w:lang w:val="es-CO"/>
         </w:rPr>
         <w:t>REGLA CRÍTICA:</w:t>
@@ -1340,6 +1438,7 @@
           <w:rFonts w:ascii="Times New Roman" w:eastAsia="Times New Roman" w:hAnsi="Times New Roman" w:cs="Times New Roman"/>
           <w:sz w:val="24"/>
           <w:szCs w:val="24"/>
+          <w:highlight w:val="green"/>
           <w:lang w:val="es-CO"/>
         </w:rPr>
         <w:t>NO eliminar ni modificar filas originales del auxiliar</w:t>
@@ -1354,16 +1453,6 @@
           <w:szCs w:val="24"/>
         </w:rPr>
       </w:pPr>
-      <w:r>
-        <w:rPr>
-          <w:rFonts w:ascii="Times New Roman" w:eastAsia="Times New Roman" w:hAnsi="Times New Roman" w:cs="Times New Roman"/>
-          <w:sz w:val="24"/>
-          <w:szCs w:val="24"/>
-        </w:rPr>
-        <w:pict w14:anchorId="228ABF07">
-          <v:rect id="_x0000_i1032" style="width:0;height:1.5pt" o:hralign="center" o:hrstd="t" o:hr="t" fillcolor="#a0a0a0" stroked="f"/>
-        </w:pict>
-      </w:r>
     </w:p>
     <w:p>
       <w:pPr>
@@ -1420,16 +1509,19 @@
           <w:bCs/>
           <w:sz w:val="24"/>
           <w:szCs w:val="24"/>
-        </w:rPr>
-      </w:pPr>
-      <w:r>
-        <w:rPr>
-          <w:rFonts w:ascii="Times New Roman" w:eastAsia="Times New Roman" w:hAnsi="Times New Roman" w:cs="Times New Roman"/>
-          <w:b/>
-          <w:bCs/>
-          <w:sz w:val="24"/>
-          <w:szCs w:val="24"/>
-        </w:rPr>
+          <w:highlight w:val="green"/>
+        </w:rPr>
+      </w:pPr>
+      <w:r>
+        <w:rPr>
+          <w:rFonts w:ascii="Times New Roman" w:eastAsia="Times New Roman" w:hAnsi="Times New Roman" w:cs="Times New Roman"/>
+          <w:b/>
+          <w:bCs/>
+          <w:sz w:val="24"/>
+          <w:szCs w:val="24"/>
+          <w:highlight w:val="green"/>
+        </w:rPr>
+        <w:lastRenderedPageBreak/>
         <w:t>1. Fila original</w:t>
       </w:r>
     </w:p>
@@ -1444,6 +1536,7 @@
           <w:rFonts w:ascii="Times New Roman" w:eastAsia="Times New Roman" w:hAnsi="Times New Roman" w:cs="Times New Roman"/>
           <w:sz w:val="24"/>
           <w:szCs w:val="24"/>
+          <w:highlight w:val="green"/>
         </w:rPr>
       </w:pPr>
       <w:proofErr w:type="spellStart"/>
@@ -1452,6 +1545,7 @@
           <w:rFonts w:ascii="Times New Roman" w:eastAsia="Times New Roman" w:hAnsi="Times New Roman" w:cs="Times New Roman"/>
           <w:sz w:val="24"/>
           <w:szCs w:val="24"/>
+          <w:highlight w:val="green"/>
         </w:rPr>
         <w:t>Tipo_Fila</w:t>
       </w:r>
@@ -1461,6 +1555,7 @@
           <w:rFonts w:ascii="Times New Roman" w:eastAsia="Times New Roman" w:hAnsi="Times New Roman" w:cs="Times New Roman"/>
           <w:sz w:val="24"/>
           <w:szCs w:val="24"/>
+          <w:highlight w:val="green"/>
         </w:rPr>
         <w:t xml:space="preserve"> = </w:t>
       </w:r>
@@ -1471,6 +1566,7 @@
           <w:bCs/>
           <w:sz w:val="24"/>
           <w:szCs w:val="24"/>
+          <w:highlight w:val="green"/>
         </w:rPr>
         <w:t>AUXILIAR</w:t>
       </w:r>
@@ -1479,6 +1575,7 @@
           <w:rFonts w:ascii="Times New Roman" w:eastAsia="Times New Roman" w:hAnsi="Times New Roman" w:cs="Times New Roman"/>
           <w:sz w:val="24"/>
           <w:szCs w:val="24"/>
+          <w:highlight w:val="green"/>
         </w:rPr>
         <w:t xml:space="preserve"> </w:t>
       </w:r>
@@ -1494,6 +1591,7 @@
           <w:rFonts w:ascii="Times New Roman" w:eastAsia="Times New Roman" w:hAnsi="Times New Roman" w:cs="Times New Roman"/>
           <w:sz w:val="24"/>
           <w:szCs w:val="24"/>
+          <w:highlight w:val="green"/>
         </w:rPr>
       </w:pPr>
       <w:proofErr w:type="spellStart"/>
@@ -1502,6 +1600,7 @@
           <w:rFonts w:ascii="Times New Roman" w:eastAsia="Times New Roman" w:hAnsi="Times New Roman" w:cs="Times New Roman"/>
           <w:sz w:val="24"/>
           <w:szCs w:val="24"/>
+          <w:highlight w:val="green"/>
         </w:rPr>
         <w:t>Mantiene</w:t>
       </w:r>
@@ -1511,6 +1610,7 @@
           <w:rFonts w:ascii="Times New Roman" w:eastAsia="Times New Roman" w:hAnsi="Times New Roman" w:cs="Times New Roman"/>
           <w:sz w:val="24"/>
           <w:szCs w:val="24"/>
+          <w:highlight w:val="green"/>
         </w:rPr>
         <w:t xml:space="preserve"> </w:t>
       </w:r>
@@ -1520,6 +1620,7 @@
           <w:rFonts w:ascii="Times New Roman" w:eastAsia="Times New Roman" w:hAnsi="Times New Roman" w:cs="Times New Roman"/>
           <w:sz w:val="24"/>
           <w:szCs w:val="24"/>
+          <w:highlight w:val="green"/>
         </w:rPr>
         <w:t>todos</w:t>
       </w:r>
@@ -1529,6 +1630,7 @@
           <w:rFonts w:ascii="Times New Roman" w:eastAsia="Times New Roman" w:hAnsi="Times New Roman" w:cs="Times New Roman"/>
           <w:sz w:val="24"/>
           <w:szCs w:val="24"/>
+          <w:highlight w:val="green"/>
         </w:rPr>
         <w:t xml:space="preserve"> los </w:t>
       </w:r>
@@ -1538,6 +1640,7 @@
           <w:rFonts w:ascii="Times New Roman" w:eastAsia="Times New Roman" w:hAnsi="Times New Roman" w:cs="Times New Roman"/>
           <w:sz w:val="24"/>
           <w:szCs w:val="24"/>
+          <w:highlight w:val="green"/>
         </w:rPr>
         <w:t>datos</w:t>
       </w:r>
@@ -1547,6 +1650,7 @@
           <w:rFonts w:ascii="Times New Roman" w:eastAsia="Times New Roman" w:hAnsi="Times New Roman" w:cs="Times New Roman"/>
           <w:sz w:val="24"/>
           <w:szCs w:val="24"/>
+          <w:highlight w:val="green"/>
         </w:rPr>
         <w:t xml:space="preserve"> </w:t>
       </w:r>
@@ -1556,6 +1660,7 @@
           <w:rFonts w:ascii="Times New Roman" w:eastAsia="Times New Roman" w:hAnsi="Times New Roman" w:cs="Times New Roman"/>
           <w:sz w:val="24"/>
           <w:szCs w:val="24"/>
+          <w:highlight w:val="green"/>
         </w:rPr>
         <w:t>originales</w:t>
       </w:r>
@@ -1565,6 +1670,7 @@
           <w:rFonts w:ascii="Times New Roman" w:eastAsia="Times New Roman" w:hAnsi="Times New Roman" w:cs="Times New Roman"/>
           <w:sz w:val="24"/>
           <w:szCs w:val="24"/>
+          <w:highlight w:val="green"/>
         </w:rPr>
         <w:t xml:space="preserve"> </w:t>
       </w:r>
@@ -1580,6 +1686,7 @@
           <w:rFonts w:ascii="Times New Roman" w:eastAsia="Times New Roman" w:hAnsi="Times New Roman" w:cs="Times New Roman"/>
           <w:sz w:val="24"/>
           <w:szCs w:val="24"/>
+          <w:highlight w:val="green"/>
         </w:rPr>
       </w:pPr>
       <w:proofErr w:type="spellStart"/>
@@ -1588,6 +1695,7 @@
           <w:rFonts w:ascii="Times New Roman" w:eastAsia="Times New Roman" w:hAnsi="Times New Roman" w:cs="Times New Roman"/>
           <w:sz w:val="24"/>
           <w:szCs w:val="24"/>
+          <w:highlight w:val="green"/>
         </w:rPr>
         <w:t>Agrega</w:t>
       </w:r>
@@ -1597,6 +1705,7 @@
           <w:rFonts w:ascii="Times New Roman" w:eastAsia="Times New Roman" w:hAnsi="Times New Roman" w:cs="Times New Roman"/>
           <w:sz w:val="24"/>
           <w:szCs w:val="24"/>
+          <w:highlight w:val="green"/>
         </w:rPr>
         <w:t xml:space="preserve">: </w:t>
       </w:r>
@@ -1612,13 +1721,15 @@
           <w:rFonts w:ascii="Times New Roman" w:eastAsia="Times New Roman" w:hAnsi="Times New Roman" w:cs="Times New Roman"/>
           <w:sz w:val="24"/>
           <w:szCs w:val="24"/>
-        </w:rPr>
-      </w:pPr>
-      <w:r>
-        <w:rPr>
-          <w:rFonts w:ascii="Times New Roman" w:eastAsia="Times New Roman" w:hAnsi="Times New Roman" w:cs="Times New Roman"/>
-          <w:sz w:val="24"/>
-          <w:szCs w:val="24"/>
+          <w:highlight w:val="green"/>
+        </w:rPr>
+      </w:pPr>
+      <w:r>
+        <w:rPr>
+          <w:rFonts w:ascii="Times New Roman" w:eastAsia="Times New Roman" w:hAnsi="Times New Roman" w:cs="Times New Roman"/>
+          <w:sz w:val="24"/>
+          <w:szCs w:val="24"/>
+          <w:highlight w:val="green"/>
         </w:rPr>
         <w:t xml:space="preserve">Suma de </w:t>
       </w:r>
@@ -1628,6 +1739,7 @@
           <w:rFonts w:ascii="Times New Roman" w:eastAsia="Times New Roman" w:hAnsi="Times New Roman" w:cs="Times New Roman"/>
           <w:sz w:val="24"/>
           <w:szCs w:val="24"/>
+          <w:highlight w:val="green"/>
         </w:rPr>
         <w:t>grupos</w:t>
       </w:r>
@@ -1637,6 +1749,7 @@
           <w:rFonts w:ascii="Times New Roman" w:eastAsia="Times New Roman" w:hAnsi="Times New Roman" w:cs="Times New Roman"/>
           <w:sz w:val="24"/>
           <w:szCs w:val="24"/>
+          <w:highlight w:val="green"/>
         </w:rPr>
         <w:t xml:space="preserve"> </w:t>
       </w:r>
@@ -1646,6 +1759,7 @@
           <w:rFonts w:ascii="Times New Roman" w:eastAsia="Times New Roman" w:hAnsi="Times New Roman" w:cs="Times New Roman"/>
           <w:sz w:val="24"/>
           <w:szCs w:val="24"/>
+          <w:highlight w:val="green"/>
         </w:rPr>
         <w:t>encontrados</w:t>
       </w:r>
@@ -1655,6 +1769,7 @@
           <w:rFonts w:ascii="Times New Roman" w:eastAsia="Times New Roman" w:hAnsi="Times New Roman" w:cs="Times New Roman"/>
           <w:sz w:val="24"/>
           <w:szCs w:val="24"/>
+          <w:highlight w:val="green"/>
         </w:rPr>
         <w:t xml:space="preserve"> </w:t>
       </w:r>
@@ -1670,6 +1785,7 @@
           <w:rFonts w:ascii="Times New Roman" w:eastAsia="Times New Roman" w:hAnsi="Times New Roman" w:cs="Times New Roman"/>
           <w:sz w:val="24"/>
           <w:szCs w:val="24"/>
+          <w:highlight w:val="green"/>
         </w:rPr>
       </w:pPr>
       <w:proofErr w:type="spellStart"/>
@@ -1678,6 +1794,7 @@
           <w:rFonts w:ascii="Times New Roman" w:eastAsia="Times New Roman" w:hAnsi="Times New Roman" w:cs="Times New Roman"/>
           <w:sz w:val="24"/>
           <w:szCs w:val="24"/>
+          <w:highlight w:val="green"/>
         </w:rPr>
         <w:t>Diferencia</w:t>
       </w:r>
@@ -1687,6 +1804,7 @@
           <w:rFonts w:ascii="Times New Roman" w:eastAsia="Times New Roman" w:hAnsi="Times New Roman" w:cs="Times New Roman"/>
           <w:sz w:val="24"/>
           <w:szCs w:val="24"/>
+          <w:highlight w:val="green"/>
         </w:rPr>
         <w:t xml:space="preserve"> contra </w:t>
       </w:r>
@@ -1696,6 +1814,7 @@
           <w:rFonts w:ascii="Times New Roman" w:eastAsia="Times New Roman" w:hAnsi="Times New Roman" w:cs="Times New Roman"/>
           <w:sz w:val="24"/>
           <w:szCs w:val="24"/>
+          <w:highlight w:val="green"/>
         </w:rPr>
         <w:t>datafono</w:t>
       </w:r>
@@ -1705,6 +1824,7 @@
           <w:rFonts w:ascii="Times New Roman" w:eastAsia="Times New Roman" w:hAnsi="Times New Roman" w:cs="Times New Roman"/>
           <w:sz w:val="24"/>
           <w:szCs w:val="24"/>
+          <w:highlight w:val="green"/>
         </w:rPr>
         <w:t xml:space="preserve"> </w:t>
       </w:r>
@@ -1716,6 +1836,7 @@
           <w:rFonts w:ascii="Times New Roman" w:eastAsia="Times New Roman" w:hAnsi="Times New Roman" w:cs="Times New Roman"/>
           <w:sz w:val="24"/>
           <w:szCs w:val="24"/>
+          <w:highlight w:val="green"/>
         </w:rPr>
       </w:pPr>
     </w:p>
@@ -1729,19 +1850,20 @@
           <w:bCs/>
           <w:sz w:val="24"/>
           <w:szCs w:val="24"/>
-          <w:lang w:val="es-CO"/>
-        </w:rPr>
-      </w:pPr>
-      <w:r>
-        <w:rPr>
-          <w:rFonts w:ascii="Times New Roman" w:eastAsia="Times New Roman" w:hAnsi="Times New Roman" w:cs="Times New Roman"/>
-          <w:b/>
-          <w:bCs/>
-          <w:sz w:val="24"/>
-          <w:szCs w:val="24"/>
-          <w:lang w:val="es-CO"/>
-        </w:rPr>
-        <w:lastRenderedPageBreak/>
+          <w:highlight w:val="green"/>
+          <w:lang w:val="es-CO"/>
+        </w:rPr>
+      </w:pPr>
+      <w:r>
+        <w:rPr>
+          <w:rFonts w:ascii="Times New Roman" w:eastAsia="Times New Roman" w:hAnsi="Times New Roman" w:cs="Times New Roman"/>
+          <w:b/>
+          <w:bCs/>
+          <w:sz w:val="24"/>
+          <w:szCs w:val="24"/>
+          <w:highlight w:val="green"/>
+          <w:lang w:val="es-CO"/>
+        </w:rPr>
         <w:t>2. Filas adicionales (debajo)</w:t>
       </w:r>
     </w:p>
@@ -1752,14 +1874,16 @@
           <w:rFonts w:ascii="Times New Roman" w:eastAsia="Times New Roman" w:hAnsi="Times New Roman" w:cs="Times New Roman"/>
           <w:sz w:val="24"/>
           <w:szCs w:val="24"/>
-          <w:lang w:val="es-CO"/>
-        </w:rPr>
-      </w:pPr>
-      <w:r>
-        <w:rPr>
-          <w:rFonts w:ascii="Times New Roman" w:eastAsia="Times New Roman" w:hAnsi="Times New Roman" w:cs="Times New Roman"/>
-          <w:sz w:val="24"/>
-          <w:szCs w:val="24"/>
+          <w:highlight w:val="green"/>
+          <w:lang w:val="es-CO"/>
+        </w:rPr>
+      </w:pPr>
+      <w:r>
+        <w:rPr>
+          <w:rFonts w:ascii="Times New Roman" w:eastAsia="Times New Roman" w:hAnsi="Times New Roman" w:cs="Times New Roman"/>
+          <w:sz w:val="24"/>
+          <w:szCs w:val="24"/>
+          <w:highlight w:val="green"/>
           <w:lang w:val="es-CO"/>
         </w:rPr>
         <w:t>Por cada grupo encontrado:</w:t>
@@ -1776,6 +1900,7 @@
           <w:rFonts w:ascii="Times New Roman" w:eastAsia="Times New Roman" w:hAnsi="Times New Roman" w:cs="Times New Roman"/>
           <w:sz w:val="24"/>
           <w:szCs w:val="24"/>
+          <w:highlight w:val="green"/>
         </w:rPr>
       </w:pPr>
       <w:proofErr w:type="spellStart"/>
@@ -1784,6 +1909,7 @@
           <w:rFonts w:ascii="Times New Roman" w:eastAsia="Times New Roman" w:hAnsi="Times New Roman" w:cs="Times New Roman"/>
           <w:sz w:val="24"/>
           <w:szCs w:val="24"/>
+          <w:highlight w:val="green"/>
         </w:rPr>
         <w:t>Tipo_Fila</w:t>
       </w:r>
@@ -1793,6 +1919,7 @@
           <w:rFonts w:ascii="Times New Roman" w:eastAsia="Times New Roman" w:hAnsi="Times New Roman" w:cs="Times New Roman"/>
           <w:sz w:val="24"/>
           <w:szCs w:val="24"/>
+          <w:highlight w:val="green"/>
         </w:rPr>
         <w:t xml:space="preserve"> = </w:t>
       </w:r>
@@ -1803,6 +1930,7 @@
           <w:bCs/>
           <w:sz w:val="24"/>
           <w:szCs w:val="24"/>
+          <w:highlight w:val="green"/>
         </w:rPr>
         <w:t>GRUPO_BOL_RUTA</w:t>
       </w:r>
@@ -1811,6 +1939,7 @@
           <w:rFonts w:ascii="Times New Roman" w:eastAsia="Times New Roman" w:hAnsi="Times New Roman" w:cs="Times New Roman"/>
           <w:sz w:val="24"/>
           <w:szCs w:val="24"/>
+          <w:highlight w:val="green"/>
         </w:rPr>
         <w:t xml:space="preserve"> </w:t>
       </w:r>
@@ -1826,6 +1955,7 @@
           <w:rFonts w:ascii="Times New Roman" w:eastAsia="Times New Roman" w:hAnsi="Times New Roman" w:cs="Times New Roman"/>
           <w:sz w:val="24"/>
           <w:szCs w:val="24"/>
+          <w:highlight w:val="green"/>
         </w:rPr>
       </w:pPr>
       <w:proofErr w:type="spellStart"/>
@@ -1834,6 +1964,7 @@
           <w:rFonts w:ascii="Times New Roman" w:eastAsia="Times New Roman" w:hAnsi="Times New Roman" w:cs="Times New Roman"/>
           <w:sz w:val="24"/>
           <w:szCs w:val="24"/>
+          <w:highlight w:val="green"/>
         </w:rPr>
         <w:t>Columnas</w:t>
       </w:r>
@@ -1843,6 +1974,7 @@
           <w:rFonts w:ascii="Times New Roman" w:eastAsia="Times New Roman" w:hAnsi="Times New Roman" w:cs="Times New Roman"/>
           <w:sz w:val="24"/>
           <w:szCs w:val="24"/>
+          <w:highlight w:val="green"/>
         </w:rPr>
         <w:t xml:space="preserve"> </w:t>
       </w:r>
@@ -1852,6 +1984,7 @@
           <w:rFonts w:ascii="Times New Roman" w:eastAsia="Times New Roman" w:hAnsi="Times New Roman" w:cs="Times New Roman"/>
           <w:sz w:val="24"/>
           <w:szCs w:val="24"/>
+          <w:highlight w:val="green"/>
         </w:rPr>
         <w:t>nuevas</w:t>
       </w:r>
@@ -1861,6 +1994,7 @@
           <w:rFonts w:ascii="Times New Roman" w:eastAsia="Times New Roman" w:hAnsi="Times New Roman" w:cs="Times New Roman"/>
           <w:sz w:val="24"/>
           <w:szCs w:val="24"/>
+          <w:highlight w:val="green"/>
         </w:rPr>
         <w:t xml:space="preserve">: </w:t>
       </w:r>
@@ -1876,6 +2010,7 @@
           <w:rFonts w:ascii="Times New Roman" w:eastAsia="Times New Roman" w:hAnsi="Times New Roman" w:cs="Times New Roman"/>
           <w:sz w:val="24"/>
           <w:szCs w:val="24"/>
+          <w:highlight w:val="green"/>
         </w:rPr>
       </w:pPr>
       <w:proofErr w:type="spellStart"/>
@@ -1884,6 +2019,7 @@
           <w:rFonts w:ascii="Times New Roman" w:eastAsia="Times New Roman" w:hAnsi="Times New Roman" w:cs="Times New Roman"/>
           <w:sz w:val="24"/>
           <w:szCs w:val="24"/>
+          <w:highlight w:val="green"/>
         </w:rPr>
         <w:t>Fecha_Abono_Encontrada</w:t>
       </w:r>
@@ -1893,6 +2029,7 @@
           <w:rFonts w:ascii="Times New Roman" w:eastAsia="Times New Roman" w:hAnsi="Times New Roman" w:cs="Times New Roman"/>
           <w:sz w:val="24"/>
           <w:szCs w:val="24"/>
+          <w:highlight w:val="green"/>
         </w:rPr>
         <w:t xml:space="preserve"> </w:t>
       </w:r>
@@ -1908,6 +2045,7 @@
           <w:rFonts w:ascii="Times New Roman" w:eastAsia="Times New Roman" w:hAnsi="Times New Roman" w:cs="Times New Roman"/>
           <w:sz w:val="24"/>
           <w:szCs w:val="24"/>
+          <w:highlight w:val="green"/>
         </w:rPr>
       </w:pPr>
       <w:proofErr w:type="spellStart"/>
@@ -1916,6 +2054,7 @@
           <w:rFonts w:ascii="Times New Roman" w:eastAsia="Times New Roman" w:hAnsi="Times New Roman" w:cs="Times New Roman"/>
           <w:sz w:val="24"/>
           <w:szCs w:val="24"/>
+          <w:highlight w:val="green"/>
         </w:rPr>
         <w:t>Bol_Ruta_Encontrado</w:t>
       </w:r>
@@ -1925,6 +2064,7 @@
           <w:rFonts w:ascii="Times New Roman" w:eastAsia="Times New Roman" w:hAnsi="Times New Roman" w:cs="Times New Roman"/>
           <w:sz w:val="24"/>
           <w:szCs w:val="24"/>
+          <w:highlight w:val="green"/>
         </w:rPr>
         <w:t xml:space="preserve"> </w:t>
       </w:r>
@@ -1940,6 +2080,7 @@
           <w:rFonts w:ascii="Times New Roman" w:eastAsia="Times New Roman" w:hAnsi="Times New Roman" w:cs="Times New Roman"/>
           <w:sz w:val="24"/>
           <w:szCs w:val="24"/>
+          <w:highlight w:val="green"/>
         </w:rPr>
       </w:pPr>
       <w:proofErr w:type="spellStart"/>
@@ -1948,6 +2089,7 @@
           <w:rFonts w:ascii="Times New Roman" w:eastAsia="Times New Roman" w:hAnsi="Times New Roman" w:cs="Times New Roman"/>
           <w:sz w:val="24"/>
           <w:szCs w:val="24"/>
+          <w:highlight w:val="green"/>
         </w:rPr>
         <w:t>Valor_Grupo_Bol_Ruta</w:t>
       </w:r>
@@ -1957,6 +2099,7 @@
           <w:rFonts w:ascii="Times New Roman" w:eastAsia="Times New Roman" w:hAnsi="Times New Roman" w:cs="Times New Roman"/>
           <w:sz w:val="24"/>
           <w:szCs w:val="24"/>
+          <w:highlight w:val="green"/>
         </w:rPr>
         <w:t xml:space="preserve"> </w:t>
       </w:r>
@@ -2049,6 +2192,7 @@
           <w:rFonts w:ascii="Courier New" w:eastAsia="Times New Roman" w:hAnsi="Courier New" w:cs="Courier New"/>
           <w:sz w:val="20"/>
           <w:szCs w:val="20"/>
+          <w:highlight w:val="green"/>
           <w:lang w:val="es-CO"/>
         </w:rPr>
         <w:t>SUM(</w:t>
@@ -2059,6 +2203,7 @@
           <w:rFonts w:ascii="Courier New" w:eastAsia="Times New Roman" w:hAnsi="Courier New" w:cs="Courier New"/>
           <w:sz w:val="20"/>
           <w:szCs w:val="20"/>
+          <w:highlight w:val="green"/>
           <w:lang w:val="es-CO"/>
         </w:rPr>
         <w:t>Valor_Grupo_Bol_Ruta</w:t>
@@ -2069,6 +2214,7 @@
           <w:rFonts w:ascii="Courier New" w:eastAsia="Times New Roman" w:hAnsi="Courier New" w:cs="Courier New"/>
           <w:sz w:val="20"/>
           <w:szCs w:val="20"/>
+          <w:highlight w:val="green"/>
           <w:lang w:val="es-CO"/>
         </w:rPr>
         <w:t>)</w:t>
@@ -2078,6 +2224,7 @@
           <w:rFonts w:ascii="Courier New" w:eastAsia="Times New Roman" w:hAnsi="Courier New" w:cs="Courier New"/>
           <w:sz w:val="20"/>
           <w:szCs w:val="20"/>
+          <w:highlight w:val="green"/>
           <w:lang w:val="es-CO"/>
         </w:rPr>
         <w:t xml:space="preserve"> </w:t>
@@ -2087,6 +2234,7 @@
           <w:rFonts w:ascii="Courier New" w:eastAsia="Times New Roman" w:hAnsi="Courier New" w:cs="Courier New"/>
           <w:sz w:val="20"/>
           <w:szCs w:val="20"/>
+          <w:highlight w:val="green"/>
           <w:lang w:val="es-CO"/>
         </w:rPr>
         <w:t>vs</w:t>
@@ -2096,6 +2244,7 @@
           <w:rFonts w:ascii="Courier New" w:eastAsia="Times New Roman" w:hAnsi="Courier New" w:cs="Courier New"/>
           <w:sz w:val="20"/>
           <w:szCs w:val="20"/>
+          <w:highlight w:val="green"/>
           <w:lang w:val="es-CO"/>
         </w:rPr>
         <w:t xml:space="preserve"> </w:t>
@@ -2106,6 +2255,7 @@
           <w:rFonts w:ascii="Courier New" w:eastAsia="Times New Roman" w:hAnsi="Courier New" w:cs="Courier New"/>
           <w:sz w:val="20"/>
           <w:szCs w:val="20"/>
+          <w:highlight w:val="green"/>
           <w:lang w:val="es-CO"/>
         </w:rPr>
         <w:t>Valor_Auxiliar</w:t>
@@ -2121,16 +2271,6 @@
           <w:szCs w:val="24"/>
         </w:rPr>
       </w:pPr>
-      <w:r>
-        <w:rPr>
-          <w:rFonts w:ascii="Times New Roman" w:eastAsia="Times New Roman" w:hAnsi="Times New Roman" w:cs="Times New Roman"/>
-          <w:sz w:val="24"/>
-          <w:szCs w:val="24"/>
-        </w:rPr>
-        <w:pict w14:anchorId="6A051778">
-          <v:rect id="_x0000_i1035" style="width:0;height:1.5pt" o:hralign="center" o:hrstd="t" o:hr="t" fillcolor="#a0a0a0" stroked="f"/>
-        </w:pict>
-      </w:r>
     </w:p>
     <w:p>
       <w:pPr>
@@ -2142,6 +2282,7 @@
           <w:bCs/>
           <w:sz w:val="36"/>
           <w:szCs w:val="36"/>
+          <w:highlight w:val="green"/>
           <w:lang w:val="es-CO"/>
         </w:rPr>
       </w:pPr>
@@ -2152,6 +2293,7 @@
           <w:bCs/>
           <w:sz w:val="36"/>
           <w:szCs w:val="36"/>
+          <w:highlight w:val="green"/>
           <w:lang w:val="es-CO"/>
         </w:rPr>
         <w:t>INTERPRETACIÓN DE RESULTADOS</w:t>
@@ -2167,6 +2309,7 @@
           <w:bCs/>
           <w:sz w:val="27"/>
           <w:szCs w:val="27"/>
+          <w:highlight w:val="green"/>
           <w:lang w:val="es-CO"/>
         </w:rPr>
       </w:pPr>
@@ -2177,6 +2320,7 @@
           <w:bCs/>
           <w:sz w:val="27"/>
           <w:szCs w:val="27"/>
+          <w:highlight w:val="green"/>
           <w:lang w:val="es-CO"/>
         </w:rPr>
         <w:t>Caso 1 — Cuadra exacto</w:t>
@@ -2189,6 +2333,7 @@
           <w:rFonts w:ascii="Times New Roman" w:eastAsia="Times New Roman" w:hAnsi="Times New Roman" w:cs="Times New Roman"/>
           <w:sz w:val="24"/>
           <w:szCs w:val="24"/>
+          <w:highlight w:val="green"/>
         </w:rPr>
       </w:pPr>
       <w:r>
@@ -2196,6 +2341,7 @@
           <w:rFonts w:ascii="Segoe UI Emoji" w:eastAsia="Times New Roman" w:hAnsi="Segoe UI Emoji" w:cs="Segoe UI Emoji"/>
           <w:sz w:val="24"/>
           <w:szCs w:val="24"/>
+          <w:highlight w:val="green"/>
         </w:rPr>
         <w:t>✔</w:t>
       </w:r>
@@ -2204,6 +2350,7 @@
           <w:rFonts w:ascii="Times New Roman" w:eastAsia="Times New Roman" w:hAnsi="Times New Roman" w:cs="Times New Roman"/>
           <w:sz w:val="24"/>
           <w:szCs w:val="24"/>
+          <w:highlight w:val="green"/>
         </w:rPr>
         <w:t xml:space="preserve"> </w:t>
       </w:r>
@@ -2213,6 +2360,7 @@
           <w:rFonts w:ascii="Times New Roman" w:eastAsia="Times New Roman" w:hAnsi="Times New Roman" w:cs="Times New Roman"/>
           <w:sz w:val="24"/>
           <w:szCs w:val="24"/>
+          <w:highlight w:val="green"/>
         </w:rPr>
         <w:t>Registro</w:t>
       </w:r>
@@ -2222,6 +2370,7 @@
           <w:rFonts w:ascii="Times New Roman" w:eastAsia="Times New Roman" w:hAnsi="Times New Roman" w:cs="Times New Roman"/>
           <w:sz w:val="24"/>
           <w:szCs w:val="24"/>
+          <w:highlight w:val="green"/>
         </w:rPr>
         <w:t xml:space="preserve"> </w:t>
       </w:r>
@@ -2231,6 +2380,7 @@
           <w:rFonts w:ascii="Times New Roman" w:eastAsia="Times New Roman" w:hAnsi="Times New Roman" w:cs="Times New Roman"/>
           <w:sz w:val="24"/>
           <w:szCs w:val="24"/>
+          <w:highlight w:val="green"/>
         </w:rPr>
         <w:t>correcto</w:t>
       </w:r>
@@ -2246,6 +2396,7 @@
           <w:bCs/>
           <w:sz w:val="27"/>
           <w:szCs w:val="27"/>
+          <w:highlight w:val="green"/>
           <w:lang w:val="es-CO"/>
         </w:rPr>
       </w:pPr>
@@ -2256,6 +2407,7 @@
           <w:bCs/>
           <w:sz w:val="27"/>
           <w:szCs w:val="27"/>
+          <w:highlight w:val="green"/>
           <w:lang w:val="es-CO"/>
         </w:rPr>
         <w:t>Caso 2 — Diferencia menor</w:t>
@@ -2268,14 +2420,16 @@
           <w:rFonts w:ascii="Times New Roman" w:eastAsia="Times New Roman" w:hAnsi="Times New Roman" w:cs="Times New Roman"/>
           <w:sz w:val="24"/>
           <w:szCs w:val="24"/>
-          <w:lang w:val="es-CO"/>
-        </w:rPr>
-      </w:pPr>
-      <w:r>
-        <w:rPr>
-          <w:rFonts w:ascii="Times New Roman" w:eastAsia="Times New Roman" w:hAnsi="Times New Roman" w:cs="Times New Roman"/>
-          <w:sz w:val="24"/>
-          <w:szCs w:val="24"/>
+          <w:highlight w:val="green"/>
+          <w:lang w:val="es-CO"/>
+        </w:rPr>
+      </w:pPr>
+      <w:r>
+        <w:rPr>
+          <w:rFonts w:ascii="Times New Roman" w:eastAsia="Times New Roman" w:hAnsi="Times New Roman" w:cs="Times New Roman"/>
+          <w:sz w:val="24"/>
+          <w:szCs w:val="24"/>
+          <w:highlight w:val="green"/>
           <w:lang w:val="es-CO"/>
         </w:rPr>
         <w:t>Posibles causas:</w:t>
@@ -2292,6 +2446,7 @@
           <w:rFonts w:ascii="Times New Roman" w:eastAsia="Times New Roman" w:hAnsi="Times New Roman" w:cs="Times New Roman"/>
           <w:sz w:val="24"/>
           <w:szCs w:val="24"/>
+          <w:highlight w:val="green"/>
         </w:rPr>
       </w:pPr>
       <w:proofErr w:type="spellStart"/>
@@ -2300,6 +2455,7 @@
           <w:rFonts w:ascii="Times New Roman" w:eastAsia="Times New Roman" w:hAnsi="Times New Roman" w:cs="Times New Roman"/>
           <w:sz w:val="24"/>
           <w:szCs w:val="24"/>
+          <w:highlight w:val="green"/>
         </w:rPr>
         <w:t>Comisiones</w:t>
       </w:r>
@@ -2309,6 +2465,7 @@
           <w:rFonts w:ascii="Times New Roman" w:eastAsia="Times New Roman" w:hAnsi="Times New Roman" w:cs="Times New Roman"/>
           <w:sz w:val="24"/>
           <w:szCs w:val="24"/>
+          <w:highlight w:val="green"/>
         </w:rPr>
         <w:t xml:space="preserve"> </w:t>
       </w:r>
@@ -2324,6 +2481,7 @@
           <w:rFonts w:ascii="Times New Roman" w:eastAsia="Times New Roman" w:hAnsi="Times New Roman" w:cs="Times New Roman"/>
           <w:sz w:val="24"/>
           <w:szCs w:val="24"/>
+          <w:highlight w:val="green"/>
         </w:rPr>
       </w:pPr>
       <w:proofErr w:type="spellStart"/>
@@ -2332,6 +2490,7 @@
           <w:rFonts w:ascii="Times New Roman" w:eastAsia="Times New Roman" w:hAnsi="Times New Roman" w:cs="Times New Roman"/>
           <w:sz w:val="24"/>
           <w:szCs w:val="24"/>
+          <w:highlight w:val="green"/>
         </w:rPr>
         <w:t>Retenciones</w:t>
       </w:r>
@@ -2341,6 +2500,7 @@
           <w:rFonts w:ascii="Times New Roman" w:eastAsia="Times New Roman" w:hAnsi="Times New Roman" w:cs="Times New Roman"/>
           <w:sz w:val="24"/>
           <w:szCs w:val="24"/>
+          <w:highlight w:val="green"/>
         </w:rPr>
         <w:t xml:space="preserve"> </w:t>
       </w:r>
@@ -2356,6 +2516,7 @@
           <w:rFonts w:ascii="Times New Roman" w:eastAsia="Times New Roman" w:hAnsi="Times New Roman" w:cs="Times New Roman"/>
           <w:sz w:val="24"/>
           <w:szCs w:val="24"/>
+          <w:highlight w:val="green"/>
         </w:rPr>
       </w:pPr>
       <w:proofErr w:type="spellStart"/>
@@ -2364,6 +2525,7 @@
           <w:rFonts w:ascii="Times New Roman" w:eastAsia="Times New Roman" w:hAnsi="Times New Roman" w:cs="Times New Roman"/>
           <w:sz w:val="24"/>
           <w:szCs w:val="24"/>
+          <w:highlight w:val="green"/>
         </w:rPr>
         <w:t>Redondeos</w:t>
       </w:r>
@@ -2373,6 +2535,7 @@
           <w:rFonts w:ascii="Times New Roman" w:eastAsia="Times New Roman" w:hAnsi="Times New Roman" w:cs="Times New Roman"/>
           <w:sz w:val="24"/>
           <w:szCs w:val="24"/>
+          <w:highlight w:val="green"/>
         </w:rPr>
         <w:t xml:space="preserve"> </w:t>
       </w:r>
@@ -2387,6 +2550,7 @@
           <w:bCs/>
           <w:sz w:val="27"/>
           <w:szCs w:val="27"/>
+          <w:highlight w:val="green"/>
           <w:lang w:val="es-CO"/>
         </w:rPr>
       </w:pPr>
@@ -2397,6 +2561,7 @@
           <w:bCs/>
           <w:sz w:val="27"/>
           <w:szCs w:val="27"/>
+          <w:highlight w:val="green"/>
           <w:lang w:val="es-CO"/>
         </w:rPr>
         <w:t>Caso 3 — Sin coincidencias</w:t>
@@ -2409,6 +2574,7 @@
           <w:rFonts w:ascii="Times New Roman" w:eastAsia="Times New Roman" w:hAnsi="Times New Roman" w:cs="Times New Roman"/>
           <w:sz w:val="24"/>
           <w:szCs w:val="24"/>
+          <w:highlight w:val="green"/>
           <w:lang w:val="es-CO"/>
         </w:rPr>
       </w:pPr>
@@ -2417,8 +2583,10 @@
           <w:rFonts w:ascii="Segoe UI Emoji" w:eastAsia="Times New Roman" w:hAnsi="Segoe UI Emoji" w:cs="Segoe UI Emoji"/>
           <w:sz w:val="24"/>
           <w:szCs w:val="24"/>
-          <w:lang w:val="es-CO"/>
-        </w:rPr>
+          <w:highlight w:val="green"/>
+          <w:lang w:val="es-CO"/>
+        </w:rPr>
+        <w:lastRenderedPageBreak/>
         <w:t>❗</w:t>
       </w:r>
       <w:r>
@@ -2426,6 +2594,7 @@
           <w:rFonts w:ascii="Times New Roman" w:eastAsia="Times New Roman" w:hAnsi="Times New Roman" w:cs="Times New Roman"/>
           <w:sz w:val="24"/>
           <w:szCs w:val="24"/>
+          <w:highlight w:val="green"/>
           <w:lang w:val="es-CO"/>
         </w:rPr>
         <w:t xml:space="preserve"> Problema en:</w:t>
@@ -2442,6 +2611,7 @@
           <w:rFonts w:ascii="Times New Roman" w:eastAsia="Times New Roman" w:hAnsi="Times New Roman" w:cs="Times New Roman"/>
           <w:sz w:val="24"/>
           <w:szCs w:val="24"/>
+          <w:highlight w:val="green"/>
         </w:rPr>
       </w:pPr>
       <w:proofErr w:type="spellStart"/>
@@ -2450,6 +2620,7 @@
           <w:rFonts w:ascii="Times New Roman" w:eastAsia="Times New Roman" w:hAnsi="Times New Roman" w:cs="Times New Roman"/>
           <w:sz w:val="24"/>
           <w:szCs w:val="24"/>
+          <w:highlight w:val="green"/>
         </w:rPr>
         <w:t>Fecha</w:t>
       </w:r>
@@ -2459,6 +2630,7 @@
           <w:rFonts w:ascii="Times New Roman" w:eastAsia="Times New Roman" w:hAnsi="Times New Roman" w:cs="Times New Roman"/>
           <w:sz w:val="24"/>
           <w:szCs w:val="24"/>
+          <w:highlight w:val="green"/>
         </w:rPr>
         <w:t xml:space="preserve"> </w:t>
       </w:r>
@@ -2468,6 +2640,7 @@
           <w:rFonts w:ascii="Times New Roman" w:eastAsia="Times New Roman" w:hAnsi="Times New Roman" w:cs="Times New Roman"/>
           <w:sz w:val="24"/>
           <w:szCs w:val="24"/>
+          <w:highlight w:val="green"/>
         </w:rPr>
         <w:t>en</w:t>
       </w:r>
@@ -2477,8 +2650,18 @@
           <w:rFonts w:ascii="Times New Roman" w:eastAsia="Times New Roman" w:hAnsi="Times New Roman" w:cs="Times New Roman"/>
           <w:sz w:val="24"/>
           <w:szCs w:val="24"/>
+          <w:highlight w:val="green"/>
         </w:rPr>
         <w:t xml:space="preserve"> CONCEPTO </w:t>
+      </w:r>
+      <w:r>
+        <w:rPr>
+          <w:rFonts w:ascii="Times New Roman" w:eastAsia="Times New Roman" w:hAnsi="Times New Roman" w:cs="Times New Roman"/>
+          <w:sz w:val="24"/>
+          <w:szCs w:val="24"/>
+          <w:highlight w:val="green"/>
+        </w:rPr>
+        <w:t>NOTA</w:t>
       </w:r>
     </w:p>
     <w:p>
@@ -2492,13 +2675,15 @@
           <w:rFonts w:ascii="Times New Roman" w:eastAsia="Times New Roman" w:hAnsi="Times New Roman" w:cs="Times New Roman"/>
           <w:sz w:val="24"/>
           <w:szCs w:val="24"/>
-        </w:rPr>
-      </w:pPr>
-      <w:r>
-        <w:rPr>
-          <w:rFonts w:ascii="Times New Roman" w:eastAsia="Times New Roman" w:hAnsi="Times New Roman" w:cs="Times New Roman"/>
-          <w:sz w:val="24"/>
-          <w:szCs w:val="24"/>
+          <w:highlight w:val="green"/>
+        </w:rPr>
+      </w:pPr>
+      <w:r>
+        <w:rPr>
+          <w:rFonts w:ascii="Times New Roman" w:eastAsia="Times New Roman" w:hAnsi="Times New Roman" w:cs="Times New Roman"/>
+          <w:sz w:val="24"/>
+          <w:szCs w:val="24"/>
+          <w:highlight w:val="green"/>
         </w:rPr>
         <w:t xml:space="preserve">Falta de </w:t>
       </w:r>
@@ -2508,6 +2693,7 @@
           <w:rFonts w:ascii="Times New Roman" w:eastAsia="Times New Roman" w:hAnsi="Times New Roman" w:cs="Times New Roman"/>
           <w:sz w:val="24"/>
           <w:szCs w:val="24"/>
+          <w:highlight w:val="green"/>
         </w:rPr>
         <w:t>datafono</w:t>
       </w:r>
@@ -2517,6 +2703,7 @@
           <w:rFonts w:ascii="Times New Roman" w:eastAsia="Times New Roman" w:hAnsi="Times New Roman" w:cs="Times New Roman"/>
           <w:sz w:val="24"/>
           <w:szCs w:val="24"/>
+          <w:highlight w:val="green"/>
         </w:rPr>
         <w:t xml:space="preserve"> </w:t>
       </w:r>
@@ -2532,13 +2719,15 @@
           <w:rFonts w:ascii="Times New Roman" w:eastAsia="Times New Roman" w:hAnsi="Times New Roman" w:cs="Times New Roman"/>
           <w:sz w:val="24"/>
           <w:szCs w:val="24"/>
-        </w:rPr>
-      </w:pPr>
-      <w:r>
-        <w:rPr>
-          <w:rFonts w:ascii="Times New Roman" w:eastAsia="Times New Roman" w:hAnsi="Times New Roman" w:cs="Times New Roman"/>
-          <w:sz w:val="24"/>
-          <w:szCs w:val="24"/>
+          <w:highlight w:val="green"/>
+        </w:rPr>
+      </w:pPr>
+      <w:r>
+        <w:rPr>
+          <w:rFonts w:ascii="Times New Roman" w:eastAsia="Times New Roman" w:hAnsi="Times New Roman" w:cs="Times New Roman"/>
+          <w:sz w:val="24"/>
+          <w:szCs w:val="24"/>
+          <w:highlight w:val="green"/>
         </w:rPr>
         <w:t xml:space="preserve">Error </w:t>
       </w:r>
@@ -2548,6 +2737,7 @@
           <w:rFonts w:ascii="Times New Roman" w:eastAsia="Times New Roman" w:hAnsi="Times New Roman" w:cs="Times New Roman"/>
           <w:sz w:val="24"/>
           <w:szCs w:val="24"/>
+          <w:highlight w:val="green"/>
         </w:rPr>
         <w:t>contable</w:t>
       </w:r>
@@ -2557,6 +2747,7 @@
           <w:rFonts w:ascii="Times New Roman" w:eastAsia="Times New Roman" w:hAnsi="Times New Roman" w:cs="Times New Roman"/>
           <w:sz w:val="24"/>
           <w:szCs w:val="24"/>
+          <w:highlight w:val="green"/>
         </w:rPr>
         <w:t xml:space="preserve"> </w:t>
       </w:r>
@@ -2568,6 +2759,7 @@
           <w:rFonts w:ascii="Times New Roman" w:eastAsia="Times New Roman" w:hAnsi="Times New Roman" w:cs="Times New Roman"/>
           <w:sz w:val="24"/>
           <w:szCs w:val="24"/>
+          <w:highlight w:val="green"/>
         </w:rPr>
       </w:pPr>
     </w:p>
@@ -2581,6 +2773,7 @@
           <w:bCs/>
           <w:sz w:val="27"/>
           <w:szCs w:val="27"/>
+          <w:highlight w:val="green"/>
           <w:lang w:val="es-CO"/>
         </w:rPr>
       </w:pPr>
@@ -2591,9 +2784,9 @@
           <w:bCs/>
           <w:sz w:val="27"/>
           <w:szCs w:val="27"/>
-          <w:lang w:val="es-CO"/>
-        </w:rPr>
-        <w:lastRenderedPageBreak/>
+          <w:highlight w:val="green"/>
+          <w:lang w:val="es-CO"/>
+        </w:rPr>
         <w:t>Caso 4 — Más de un grupo (normal)</w:t>
       </w:r>
     </w:p>
@@ -2604,14 +2797,16 @@
           <w:rFonts w:ascii="Times New Roman" w:eastAsia="Times New Roman" w:hAnsi="Times New Roman" w:cs="Times New Roman"/>
           <w:sz w:val="24"/>
           <w:szCs w:val="24"/>
-          <w:lang w:val="es-CO"/>
-        </w:rPr>
-      </w:pPr>
-      <w:r>
-        <w:rPr>
-          <w:rFonts w:ascii="Times New Roman" w:eastAsia="Times New Roman" w:hAnsi="Times New Roman" w:cs="Times New Roman"/>
-          <w:sz w:val="24"/>
-          <w:szCs w:val="24"/>
+          <w:highlight w:val="green"/>
+          <w:lang w:val="es-CO"/>
+        </w:rPr>
+      </w:pPr>
+      <w:r>
+        <w:rPr>
+          <w:rFonts w:ascii="Times New Roman" w:eastAsia="Times New Roman" w:hAnsi="Times New Roman" w:cs="Times New Roman"/>
+          <w:sz w:val="24"/>
+          <w:szCs w:val="24"/>
+          <w:highlight w:val="green"/>
           <w:lang w:val="es-CO"/>
         </w:rPr>
         <w:t>Un registro del auxiliar puede corresponder a:</w:t>
@@ -2628,13 +2823,15 @@
           <w:rFonts w:ascii="Times New Roman" w:eastAsia="Times New Roman" w:hAnsi="Times New Roman" w:cs="Times New Roman"/>
           <w:sz w:val="24"/>
           <w:szCs w:val="24"/>
-        </w:rPr>
-      </w:pPr>
-      <w:r>
-        <w:rPr>
-          <w:rFonts w:ascii="Times New Roman" w:eastAsia="Times New Roman" w:hAnsi="Times New Roman" w:cs="Times New Roman"/>
-          <w:sz w:val="24"/>
-          <w:szCs w:val="24"/>
+          <w:highlight w:val="green"/>
+        </w:rPr>
+      </w:pPr>
+      <w:r>
+        <w:rPr>
+          <w:rFonts w:ascii="Times New Roman" w:eastAsia="Times New Roman" w:hAnsi="Times New Roman" w:cs="Times New Roman"/>
+          <w:sz w:val="24"/>
+          <w:szCs w:val="24"/>
+          <w:highlight w:val="green"/>
         </w:rPr>
         <w:t xml:space="preserve">1, 2 o 3 </w:t>
       </w:r>
@@ -2644,6 +2841,7 @@
           <w:rFonts w:ascii="Times New Roman" w:eastAsia="Times New Roman" w:hAnsi="Times New Roman" w:cs="Times New Roman"/>
           <w:sz w:val="24"/>
           <w:szCs w:val="24"/>
+          <w:highlight w:val="green"/>
         </w:rPr>
         <w:t>Bol_Ruta</w:t>
       </w:r>
@@ -2653,6 +2851,7 @@
           <w:rFonts w:ascii="Times New Roman" w:eastAsia="Times New Roman" w:hAnsi="Times New Roman" w:cs="Times New Roman"/>
           <w:sz w:val="24"/>
           <w:szCs w:val="24"/>
+          <w:highlight w:val="green"/>
         </w:rPr>
         <w:t xml:space="preserve"> </w:t>
       </w:r>
@@ -2664,14 +2863,16 @@
           <w:rFonts w:ascii="Times New Roman" w:eastAsia="Times New Roman" w:hAnsi="Times New Roman" w:cs="Times New Roman"/>
           <w:sz w:val="24"/>
           <w:szCs w:val="24"/>
-          <w:lang w:val="es-CO"/>
-        </w:rPr>
-      </w:pPr>
-      <w:r>
-        <w:rPr>
-          <w:rFonts w:ascii="Times New Roman" w:eastAsia="Times New Roman" w:hAnsi="Times New Roman" w:cs="Times New Roman"/>
-          <w:sz w:val="24"/>
-          <w:szCs w:val="24"/>
+          <w:highlight w:val="green"/>
+          <w:lang w:val="es-CO"/>
+        </w:rPr>
+      </w:pPr>
+      <w:r>
+        <w:rPr>
+          <w:rFonts w:ascii="Times New Roman" w:eastAsia="Times New Roman" w:hAnsi="Times New Roman" w:cs="Times New Roman"/>
+          <w:sz w:val="24"/>
+          <w:szCs w:val="24"/>
+          <w:highlight w:val="green"/>
           <w:lang w:val="es-CO"/>
         </w:rPr>
         <w:t xml:space="preserve"> Esto es comportamiento normal del banco</w:t>
@@ -2687,6 +2888,7 @@
           <w:bCs/>
           <w:sz w:val="36"/>
           <w:szCs w:val="36"/>
+          <w:highlight w:val="green"/>
           <w:lang w:val="es-CO"/>
         </w:rPr>
       </w:pPr>
@@ -2697,6 +2899,7 @@
           <w:bCs/>
           <w:sz w:val="36"/>
           <w:szCs w:val="36"/>
+          <w:highlight w:val="green"/>
           <w:lang w:val="es-CO"/>
         </w:rPr>
         <w:t>ERRORES QUE NO SE DEBEN COMETER</w:t>
@@ -2717,6 +2920,7 @@
           <w:rFonts w:ascii="Segoe UI Emoji" w:eastAsia="Times New Roman" w:hAnsi="Segoe UI Emoji" w:cs="Segoe UI Emoji"/>
           <w:sz w:val="24"/>
           <w:szCs w:val="24"/>
+          <w:highlight w:val="green"/>
           <w:lang w:val="es-CO"/>
         </w:rPr>
         <w:t>❌</w:t>
@@ -2726,6 +2930,7 @@
           <w:rFonts w:ascii="Times New Roman" w:eastAsia="Times New Roman" w:hAnsi="Times New Roman" w:cs="Times New Roman"/>
           <w:sz w:val="24"/>
           <w:szCs w:val="24"/>
+          <w:highlight w:val="green"/>
           <w:lang w:val="es-CO"/>
         </w:rPr>
         <w:t xml:space="preserve"> Cruzar por Fecha Vale</w:t>
@@ -2735,6 +2940,7 @@
           <w:rFonts w:ascii="Times New Roman" w:eastAsia="Times New Roman" w:hAnsi="Times New Roman" w:cs="Times New Roman"/>
           <w:sz w:val="24"/>
           <w:szCs w:val="24"/>
+          <w:highlight w:val="green"/>
           <w:lang w:val="es-CO"/>
         </w:rPr>
         <w:br/>
@@ -2744,6 +2950,7 @@
           <w:rFonts w:ascii="Segoe UI Emoji" w:eastAsia="Times New Roman" w:hAnsi="Segoe UI Emoji" w:cs="Segoe UI Emoji"/>
           <w:sz w:val="24"/>
           <w:szCs w:val="24"/>
+          <w:highlight w:val="green"/>
           <w:lang w:val="es-CO"/>
         </w:rPr>
         <w:t>❌</w:t>
@@ -2753,6 +2960,7 @@
           <w:rFonts w:ascii="Times New Roman" w:eastAsia="Times New Roman" w:hAnsi="Times New Roman" w:cs="Times New Roman"/>
           <w:sz w:val="24"/>
           <w:szCs w:val="24"/>
+          <w:highlight w:val="green"/>
           <w:lang w:val="es-CO"/>
         </w:rPr>
         <w:t xml:space="preserve"> Usar valor bruto en vez de Valor Neto</w:t>
@@ -2762,6 +2970,7 @@
           <w:rFonts w:ascii="Times New Roman" w:eastAsia="Times New Roman" w:hAnsi="Times New Roman" w:cs="Times New Roman"/>
           <w:sz w:val="24"/>
           <w:szCs w:val="24"/>
+          <w:highlight w:val="green"/>
           <w:lang w:val="es-CO"/>
         </w:rPr>
         <w:br/>
@@ -2771,6 +2980,7 @@
           <w:rFonts w:ascii="Segoe UI Emoji" w:eastAsia="Times New Roman" w:hAnsi="Segoe UI Emoji" w:cs="Segoe UI Emoji"/>
           <w:sz w:val="24"/>
           <w:szCs w:val="24"/>
+          <w:highlight w:val="green"/>
           <w:lang w:val="es-CO"/>
         </w:rPr>
         <w:t>❌</w:t>
@@ -2780,6 +2990,7 @@
           <w:rFonts w:ascii="Times New Roman" w:eastAsia="Times New Roman" w:hAnsi="Times New Roman" w:cs="Times New Roman"/>
           <w:sz w:val="24"/>
           <w:szCs w:val="24"/>
+          <w:highlight w:val="green"/>
           <w:lang w:val="es-CO"/>
         </w:rPr>
         <w:t xml:space="preserve"> Agrupar por fecha sin </w:t>
@@ -2790,6 +3001,7 @@
           <w:rFonts w:ascii="Times New Roman" w:eastAsia="Times New Roman" w:hAnsi="Times New Roman" w:cs="Times New Roman"/>
           <w:sz w:val="24"/>
           <w:szCs w:val="24"/>
+          <w:highlight w:val="green"/>
           <w:lang w:val="es-CO"/>
         </w:rPr>
         <w:t>Bol_Ruta</w:t>
@@ -2800,6 +3012,7 @@
           <w:rFonts w:ascii="Times New Roman" w:eastAsia="Times New Roman" w:hAnsi="Times New Roman" w:cs="Times New Roman"/>
           <w:sz w:val="24"/>
           <w:szCs w:val="24"/>
+          <w:highlight w:val="green"/>
           <w:lang w:val="es-CO"/>
         </w:rPr>
         <w:br/>
@@ -2809,6 +3022,7 @@
           <w:rFonts w:ascii="Segoe UI Emoji" w:eastAsia="Times New Roman" w:hAnsi="Segoe UI Emoji" w:cs="Segoe UI Emoji"/>
           <w:sz w:val="24"/>
           <w:szCs w:val="24"/>
+          <w:highlight w:val="green"/>
           <w:lang w:val="es-CO"/>
         </w:rPr>
         <w:t>❌</w:t>
@@ -2818,6 +3032,7 @@
           <w:rFonts w:ascii="Times New Roman" w:eastAsia="Times New Roman" w:hAnsi="Times New Roman" w:cs="Times New Roman"/>
           <w:sz w:val="24"/>
           <w:szCs w:val="24"/>
+          <w:highlight w:val="green"/>
           <w:lang w:val="es-CO"/>
         </w:rPr>
         <w:t xml:space="preserve"> Eliminar filas del auxiliar</w:t>
@@ -2827,6 +3042,7 @@
           <w:rFonts w:ascii="Times New Roman" w:eastAsia="Times New Roman" w:hAnsi="Times New Roman" w:cs="Times New Roman"/>
           <w:sz w:val="24"/>
           <w:szCs w:val="24"/>
+          <w:highlight w:val="green"/>
           <w:lang w:val="es-CO"/>
         </w:rPr>
         <w:br/>
@@ -2836,6 +3052,7 @@
           <w:rFonts w:ascii="Segoe UI Emoji" w:eastAsia="Times New Roman" w:hAnsi="Segoe UI Emoji" w:cs="Segoe UI Emoji"/>
           <w:sz w:val="24"/>
           <w:szCs w:val="24"/>
+          <w:highlight w:val="green"/>
           <w:lang w:val="es-CO"/>
         </w:rPr>
         <w:t>❌</w:t>
@@ -2845,9 +3062,20 @@
           <w:rFonts w:ascii="Times New Roman" w:eastAsia="Times New Roman" w:hAnsi="Times New Roman" w:cs="Times New Roman"/>
           <w:sz w:val="24"/>
           <w:szCs w:val="24"/>
+          <w:highlight w:val="green"/>
           <w:lang w:val="es-CO"/>
         </w:rPr>
         <w:t xml:space="preserve"> No extraer correctamente la fecha del CONCEPTO</w:t>
+      </w:r>
+      <w:r>
+        <w:rPr>
+          <w:rFonts w:ascii="Times New Roman" w:eastAsia="Times New Roman" w:hAnsi="Times New Roman" w:cs="Times New Roman"/>
+          <w:sz w:val="24"/>
+          <w:szCs w:val="24"/>
+          <w:highlight w:val="green"/>
+          <w:lang w:val="es-CO"/>
+        </w:rPr>
+        <w:t xml:space="preserve"> NOTA</w:t>
       </w:r>
     </w:p>
     <w:p>
@@ -2873,6 +3101,7 @@
           <w:bCs/>
           <w:sz w:val="36"/>
           <w:szCs w:val="36"/>
+          <w:highlight w:val="yellow"/>
         </w:rPr>
       </w:pPr>
       <w:r>
@@ -2882,6 +3111,7 @@
           <w:bCs/>
           <w:sz w:val="36"/>
           <w:szCs w:val="36"/>
+          <w:highlight w:val="yellow"/>
         </w:rPr>
         <w:t>CRITERIO CONTABLE CORRECTO</w:t>
       </w:r>
@@ -2897,14 +3127,16 @@
           <w:rFonts w:ascii="Times New Roman" w:eastAsia="Times New Roman" w:hAnsi="Times New Roman" w:cs="Times New Roman"/>
           <w:sz w:val="24"/>
           <w:szCs w:val="24"/>
-          <w:lang w:val="es-CO"/>
-        </w:rPr>
-      </w:pPr>
-      <w:r>
-        <w:rPr>
-          <w:rFonts w:ascii="Times New Roman" w:eastAsia="Times New Roman" w:hAnsi="Times New Roman" w:cs="Times New Roman"/>
-          <w:sz w:val="24"/>
-          <w:szCs w:val="24"/>
+          <w:highlight w:val="yellow"/>
+          <w:lang w:val="es-CO"/>
+        </w:rPr>
+      </w:pPr>
+      <w:r>
+        <w:rPr>
+          <w:rFonts w:ascii="Times New Roman" w:eastAsia="Times New Roman" w:hAnsi="Times New Roman" w:cs="Times New Roman"/>
+          <w:sz w:val="24"/>
+          <w:szCs w:val="24"/>
+          <w:highlight w:val="yellow"/>
           <w:lang w:val="es-CO"/>
         </w:rPr>
         <w:t xml:space="preserve">Reconocimiento contable → Fecha de operación (vale) </w:t>
@@ -2921,6 +3153,7 @@
           <w:rFonts w:ascii="Times New Roman" w:eastAsia="Times New Roman" w:hAnsi="Times New Roman" w:cs="Times New Roman"/>
           <w:sz w:val="24"/>
           <w:szCs w:val="24"/>
+          <w:highlight w:val="yellow"/>
         </w:rPr>
       </w:pPr>
       <w:proofErr w:type="spellStart"/>
@@ -2929,6 +3162,7 @@
           <w:rFonts w:ascii="Times New Roman" w:eastAsia="Times New Roman" w:hAnsi="Times New Roman" w:cs="Times New Roman"/>
           <w:sz w:val="24"/>
           <w:szCs w:val="24"/>
+          <w:highlight w:val="yellow"/>
         </w:rPr>
         <w:t>Conciliación</w:t>
       </w:r>
@@ -2938,6 +3172,7 @@
           <w:rFonts w:ascii="Times New Roman" w:eastAsia="Times New Roman" w:hAnsi="Times New Roman" w:cs="Times New Roman"/>
           <w:sz w:val="24"/>
           <w:szCs w:val="24"/>
+          <w:highlight w:val="yellow"/>
         </w:rPr>
         <w:t xml:space="preserve"> </w:t>
       </w:r>
@@ -2947,6 +3182,7 @@
           <w:rFonts w:ascii="Times New Roman" w:eastAsia="Times New Roman" w:hAnsi="Times New Roman" w:cs="Times New Roman"/>
           <w:sz w:val="24"/>
           <w:szCs w:val="24"/>
+          <w:highlight w:val="yellow"/>
         </w:rPr>
         <w:t>bancaria</w:t>
       </w:r>
@@ -2956,6 +3192,7 @@
           <w:rFonts w:ascii="Times New Roman" w:eastAsia="Times New Roman" w:hAnsi="Times New Roman" w:cs="Times New Roman"/>
           <w:sz w:val="24"/>
           <w:szCs w:val="24"/>
+          <w:highlight w:val="yellow"/>
         </w:rPr>
         <w:t xml:space="preserve"> → </w:t>
       </w:r>
@@ -2965,6 +3202,7 @@
           <w:rFonts w:ascii="Times New Roman" w:eastAsia="Times New Roman" w:hAnsi="Times New Roman" w:cs="Times New Roman"/>
           <w:sz w:val="24"/>
           <w:szCs w:val="24"/>
+          <w:highlight w:val="yellow"/>
         </w:rPr>
         <w:t>Fecha</w:t>
       </w:r>
@@ -2974,6 +3212,7 @@
           <w:rFonts w:ascii="Times New Roman" w:eastAsia="Times New Roman" w:hAnsi="Times New Roman" w:cs="Times New Roman"/>
           <w:sz w:val="24"/>
           <w:szCs w:val="24"/>
+          <w:highlight w:val="yellow"/>
         </w:rPr>
         <w:t xml:space="preserve"> de </w:t>
       </w:r>
@@ -2983,6 +3222,7 @@
           <w:rFonts w:ascii="Times New Roman" w:eastAsia="Times New Roman" w:hAnsi="Times New Roman" w:cs="Times New Roman"/>
           <w:sz w:val="24"/>
           <w:szCs w:val="24"/>
+          <w:highlight w:val="yellow"/>
         </w:rPr>
         <w:t>abono</w:t>
       </w:r>
@@ -2992,6 +3232,7 @@
           <w:rFonts w:ascii="Times New Roman" w:eastAsia="Times New Roman" w:hAnsi="Times New Roman" w:cs="Times New Roman"/>
           <w:sz w:val="24"/>
           <w:szCs w:val="24"/>
+          <w:highlight w:val="yellow"/>
         </w:rPr>
         <w:t xml:space="preserve"> </w:t>
       </w:r>
@@ -3007,13 +3248,15 @@
           <w:rFonts w:ascii="Times New Roman" w:eastAsia="Times New Roman" w:hAnsi="Times New Roman" w:cs="Times New Roman"/>
           <w:sz w:val="24"/>
           <w:szCs w:val="24"/>
-        </w:rPr>
-      </w:pPr>
-      <w:r>
-        <w:rPr>
-          <w:rFonts w:ascii="Times New Roman" w:eastAsia="Times New Roman" w:hAnsi="Times New Roman" w:cs="Times New Roman"/>
-          <w:sz w:val="24"/>
-          <w:szCs w:val="24"/>
+          <w:highlight w:val="yellow"/>
+        </w:rPr>
+      </w:pPr>
+      <w:r>
+        <w:rPr>
+          <w:rFonts w:ascii="Times New Roman" w:eastAsia="Times New Roman" w:hAnsi="Times New Roman" w:cs="Times New Roman"/>
+          <w:sz w:val="24"/>
+          <w:szCs w:val="24"/>
+          <w:highlight w:val="yellow"/>
         </w:rPr>
         <w:t xml:space="preserve">Valor </w:t>
       </w:r>
@@ -3023,6 +3266,7 @@
           <w:rFonts w:ascii="Times New Roman" w:eastAsia="Times New Roman" w:hAnsi="Times New Roman" w:cs="Times New Roman"/>
           <w:sz w:val="24"/>
           <w:szCs w:val="24"/>
+          <w:highlight w:val="yellow"/>
         </w:rPr>
         <w:t>conciliable</w:t>
       </w:r>
@@ -3032,6 +3276,7 @@
           <w:rFonts w:ascii="Times New Roman" w:eastAsia="Times New Roman" w:hAnsi="Times New Roman" w:cs="Times New Roman"/>
           <w:sz w:val="24"/>
           <w:szCs w:val="24"/>
+          <w:highlight w:val="yellow"/>
         </w:rPr>
         <w:t xml:space="preserve"> → </w:t>
       </w:r>
@@ -3041,6 +3286,7 @@
           <w:rFonts w:ascii="Times New Roman" w:eastAsia="Times New Roman" w:hAnsi="Times New Roman" w:cs="Times New Roman"/>
           <w:sz w:val="24"/>
           <w:szCs w:val="24"/>
+          <w:highlight w:val="yellow"/>
         </w:rPr>
         <w:t>Neto</w:t>
       </w:r>
@@ -3050,6 +3296,7 @@
           <w:rFonts w:ascii="Times New Roman" w:eastAsia="Times New Roman" w:hAnsi="Times New Roman" w:cs="Times New Roman"/>
           <w:sz w:val="24"/>
           <w:szCs w:val="24"/>
+          <w:highlight w:val="yellow"/>
         </w:rPr>
         <w:t xml:space="preserve"> </w:t>
       </w:r>
@@ -3078,6 +3325,8 @@
         </w:rPr>
         <w:t>RESULTADO FINAL</w:t>
       </w:r>
+      <w:bookmarkStart w:id="0" w:name="_GoBack"/>
+      <w:bookmarkEnd w:id="0"/>
     </w:p>
     <w:p>
       <w:pPr>
@@ -3367,7 +3616,7 @@
 <w:numbering xmlns:wpc="http://schemas.microsoft.com/office/word/2010/wordprocessingCanvas" xmlns:cx="http://schemas.microsoft.com/office/drawing/2014/chartex" xmlns:cx1="http://schemas.microsoft.com/office/drawing/2015/9/8/chartex" xmlns:cx2="http://schemas.microsoft.com/office/drawing/2015/10/21/chartex" xmlns:cx3="http://schemas.microsoft.com/office/drawing/2016/5/9/chartex" xmlns:cx4="http://schemas.microsoft.com/office/drawing/2016/5/10/chartex" xmlns:cx5="http://schemas.microsoft.com/office/drawing/2016/5/11/chartex" xmlns:cx6="http://schemas.microsoft.com/office/drawing/2016/5/12/chartex" xmlns:cx7="http://schemas.microsoft.com/office/drawing/2016/5/13/chartex" xmlns:cx8="http://schemas.microsoft.com/office/drawing/2016/5/14/chartex" xmlns:mc="http://schemas.openxmlformats.org/markup-compatibility/2006" xmlns:aink="http://schemas.microsoft.com/office/drawing/2016/ink" xmlns:am3d="http://schemas.microsoft.com/office/drawing/2017/model3d" xmlns:o="urn:schemas-microsoft-com:office:office" xmlns:r="http://schemas.openxmlformats.org/officeDocument/2006/relationships" xmlns:m="http://schemas.openxmlformats.org/officeDocument/2006/math" xmlns:v="urn:schemas-microsoft-com:vml" xmlns:wp14="http://schemas.microsoft.com/office/word/2010/wordprocessingDrawing" xmlns:wp="http://schemas.openxmlformats.org/drawingml/2006/wordprocessingDrawing" xmlns:w10="urn:schemas-microsoft-com:office:word" xmlns:w="http://schemas.openxmlformats.org/wordprocessingml/2006/main" xmlns:w14="http://schemas.microsoft.com/office/word/2010/wordml" xmlns:w15="http://schemas.microsoft.com/office/word/2012/wordml" xmlns:w16cid="http://schemas.microsoft.com/office/word/2016/wordml/cid" xmlns:w16se="http://schemas.microsoft.com/office/word/2015/wordml/symex" xmlns:wpg="http://schemas.microsoft.com/office/word/2010/wordprocessingGroup" xmlns:wpi="http://schemas.microsoft.com/office/word/2010/wordprocessingInk" xmlns:wne="http://schemas.microsoft.com/office/word/2006/wordml" xmlns:wps="http://schemas.microsoft.com/office/word/2010/wordprocessingShape" mc:Ignorable="w14 w15 w16se w16cid wp14">
   <w:numPicBullet w:numPicBulletId="0">
     <w:pict>
-      <v:rect id="_x0000_i1028" style="width:0;height:1.5pt" o:hralign="center" o:bullet="t" o:hrstd="t" o:hr="t" fillcolor="#a0a0a0" stroked="f"/>
+      <v:rect id="_x0000_i1058" style="width:0;height:1.5pt" o:hralign="center" o:bullet="t" o:hrstd="t" o:hr="t" fillcolor="#a0a0a0" stroked="f"/>
     </w:pict>
   </w:numPicBullet>
   <w:abstractNum w:abstractNumId="0" w15:restartNumberingAfterBreak="0">

</xml_diff>